<commit_message>
2-col spacing fixes: caption spacing, top margin above wide floats, abstract-keywords gap
docx_sync additions:
- tighten_caption_spacing: Table Caption style default is 12pt before + 3pt after;
  set to 2pt each. Same for Image Caption/Caption. Fixes visible gap between
  tables/figures and their captions.
- add_top_margin_above_wide_floats: wide (full-width, 1-column-section) tables
  and figures landed flush against the top text margin. Insert a spacer
  paragraph with exact 10pt line height inside each 1-column section, right
  before the first content block, so the gap actually renders (Word normally
  clamps section-break paragraph heights). 21 spacers added.
- fix_abstract_keywords_spacing: 6pt space-before on the 'Keywords:' paragraph
  so it doesn't sit flush against the abstract body.

Rebuilt circa_2col.docx + circa_2col.pdf (18 pp).
</commit_message>
<xml_diff>
--- a/circa_2col.docx
+++ b/circa_2col.docx
@@ -3,6 +3,11 @@
 <w:document xmlns:w="http://schemas.openxmlformats.org/wordprocessingml/2006/main" xmlns:m="http://schemas.openxmlformats.org/officeDocument/2006/math" xmlns:r="http://schemas.openxmlformats.org/officeDocument/2006/relationships" xmlns:o="urn:schemas-microsoft-com:office:office" xmlns:v="urn:schemas-microsoft-com:vml" xmlns:w10="urn:schemas-microsoft-com:office:word" xmlns:a="http://schemas.openxmlformats.org/drawingml/2006/main" xmlns:pic="http://schemas.openxmlformats.org/drawingml/2006/picture" xmlns:wp="http://schemas.openxmlformats.org/drawingml/2006/wordprocessingDrawing">
   <w:body>
     <w:bookmarkStart w:id="55" w:name="Xca456586ba90ede7a642fbb2e19b9d4ece9f0aa"/>
+    <w:p>
+      <w:pPr>
+        <w:spacing w:line="200" w:lineRule="exact" w:before="0" w:after="0"/>
+      </w:pPr>
+    </w:p>
     <w:p>
       <w:pPr>
         <w:pStyle w:val="Title"/>
@@ -261,6 +266,7 @@
     <w:p>
       <w:pPr>
         <w:pStyle w:val="Keywords"/>
+        <w:spacing w:before="120"/>
         <w:jc w:val="both"/>
         <w:keepNext w:val="0"/>
         <w:keepLines w:val="0"/>
@@ -1275,6 +1281,11 @@
         </w:sectPr>
       </w:pPr>
     </w:p>
+    <w:p>
+      <w:pPr>
+        <w:spacing w:line="200" w:lineRule="exact" w:before="0" w:after="0"/>
+      </w:pPr>
+    </w:p>
     <w:tbl>
       <w:tblPr>
         <w:tblStyle w:val="Table"/>
@@ -3598,7 +3609,7 @@
     <w:p>
       <w:pPr>
         <w:pStyle w:val="TableCaption"/>
-        <w:spacing w:before="240" w:after="60" w:line="240" w:lineRule="auto"/>
+        <w:spacing w:before="40" w:after="40" w:line="240" w:lineRule="auto"/>
         <w:jc w:val="center"/>
         <w:keepNext/>
         <w:keepLines/>
@@ -3780,6 +3791,11 @@
           <w:cols w:num="2" w:space="288" w:equalWidth="1"/>
           <w:docGrid w:linePitch="360"/>
         </w:sectPr>
+      </w:pPr>
+    </w:p>
+    <w:p>
+      <w:pPr>
+        <w:spacing w:line="200" w:lineRule="exact" w:before="0" w:after="0"/>
       </w:pPr>
     </w:p>
     <w:tbl>
@@ -5062,7 +5078,7 @@
     <w:p>
       <w:pPr>
         <w:pStyle w:val="TableCaption"/>
-        <w:spacing w:before="240" w:after="60" w:line="240" w:lineRule="auto"/>
+        <w:spacing w:before="40" w:after="40" w:line="240" w:lineRule="auto"/>
         <w:jc w:val="center"/>
         <w:keepNext/>
         <w:keepLines/>
@@ -5215,6 +5231,11 @@
           <w:cols w:num="2" w:space="288" w:equalWidth="1"/>
           <w:docGrid w:linePitch="360"/>
         </w:sectPr>
+      </w:pPr>
+    </w:p>
+    <w:p>
+      <w:pPr>
+        <w:spacing w:line="200" w:lineRule="exact" w:before="0" w:after="0"/>
       </w:pPr>
     </w:p>
     <w:tbl>
@@ -6337,7 +6358,7 @@
     <w:p>
       <w:pPr>
         <w:pStyle w:val="TableCaption"/>
-        <w:spacing w:before="240" w:after="60" w:line="240" w:lineRule="auto"/>
+        <w:spacing w:before="40" w:after="40" w:line="240" w:lineRule="auto"/>
         <w:jc w:val="center"/>
         <w:keepNext/>
         <w:keepLines/>
@@ -6450,6 +6471,11 @@
         </w:sectPr>
       </w:pPr>
     </w:p>
+    <w:p>
+      <w:pPr>
+        <w:spacing w:line="200" w:lineRule="exact" w:before="0" w:after="0"/>
+      </w:pPr>
+    </w:p>
     <w:tbl>
       <w:tblPr>
         <w:tblStyle w:val="Table"/>
@@ -7099,7 +7125,7 @@
     <w:p>
       <w:pPr>
         <w:pStyle w:val="TableCaption"/>
-        <w:spacing w:before="240" w:after="60" w:line="240" w:lineRule="auto"/>
+        <w:spacing w:before="40" w:after="40" w:line="240" w:lineRule="auto"/>
         <w:jc w:val="center"/>
         <w:keepNext/>
         <w:keepLines/>
@@ -7233,6 +7259,11 @@
           <w:cols w:num="2" w:space="288" w:equalWidth="1"/>
           <w:docGrid w:linePitch="360"/>
         </w:sectPr>
+      </w:pPr>
+    </w:p>
+    <w:p>
+      <w:pPr>
+        <w:spacing w:line="200" w:lineRule="exact" w:before="0" w:after="0"/>
       </w:pPr>
     </w:p>
     <w:tbl>
@@ -8472,7 +8503,7 @@
     <w:p>
       <w:pPr>
         <w:pStyle w:val="TableCaption"/>
-        <w:spacing w:before="240" w:after="60" w:line="240" w:lineRule="auto"/>
+        <w:spacing w:before="40" w:after="40" w:line="240" w:lineRule="auto"/>
         <w:jc w:val="center"/>
         <w:keepNext/>
         <w:keepLines/>
@@ -8698,6 +8729,11 @@
           <w:cols w:num="2" w:space="288" w:equalWidth="1"/>
           <w:docGrid w:linePitch="360"/>
         </w:sectPr>
+      </w:pPr>
+    </w:p>
+    <w:p>
+      <w:pPr>
+        <w:spacing w:line="200" w:lineRule="exact" w:before="0" w:after="0"/>
       </w:pPr>
     </w:p>
     <w:tbl>
@@ -8926,6 +8962,11 @@
         </w:sectPr>
       </w:pPr>
     </w:p>
+    <w:p>
+      <w:pPr>
+        <w:spacing w:line="200" w:lineRule="exact" w:before="0" w:after="0"/>
+      </w:pPr>
+    </w:p>
     <w:tbl>
       <w:tblPr>
         <w:tblStyle w:val="Table"/>
@@ -10633,7 +10674,7 @@
     <w:p>
       <w:pPr>
         <w:pStyle w:val="TableCaption"/>
-        <w:spacing w:before="240" w:after="60" w:line="240" w:lineRule="auto"/>
+        <w:spacing w:before="40" w:after="40" w:line="240" w:lineRule="auto"/>
         <w:jc w:val="center"/>
         <w:keepNext/>
         <w:keepLines/>
@@ -10715,6 +10756,11 @@
           <w:cols w:num="2" w:space="288" w:equalWidth="1"/>
           <w:docGrid w:linePitch="360"/>
         </w:sectPr>
+      </w:pPr>
+    </w:p>
+    <w:p>
+      <w:pPr>
+        <w:spacing w:line="200" w:lineRule="exact" w:before="0" w:after="0"/>
       </w:pPr>
     </w:p>
     <w:p>
@@ -10771,7 +10817,7 @@
     <w:p>
       <w:pPr>
         <w:pStyle w:val="ImageCaption"/>
-        <w:spacing w:before="80" w:after="120" w:line="240" w:lineRule="auto"/>
+        <w:spacing w:before="40" w:after="40" w:line="240" w:lineRule="auto"/>
         <w:jc w:val="center"/>
         <w:keepNext w:val="0"/>
         <w:keepLines/>
@@ -10872,6 +10918,11 @@
           <w:cols w:num="2" w:space="288" w:equalWidth="1"/>
           <w:docGrid w:linePitch="360"/>
         </w:sectPr>
+      </w:pPr>
+    </w:p>
+    <w:p>
+      <w:pPr>
+        <w:spacing w:line="200" w:lineRule="exact" w:before="0" w:after="0"/>
       </w:pPr>
     </w:p>
     <w:p>
@@ -10928,7 +10979,7 @@
     <w:p>
       <w:pPr>
         <w:pStyle w:val="ImageCaption"/>
-        <w:spacing w:before="80" w:after="120" w:line="240" w:lineRule="auto"/>
+        <w:spacing w:before="40" w:after="40" w:line="240" w:lineRule="auto"/>
         <w:jc w:val="center"/>
         <w:keepNext w:val="0"/>
         <w:keepLines/>
@@ -11129,6 +11180,11 @@
         </w:sectPr>
       </w:pPr>
     </w:p>
+    <w:p>
+      <w:pPr>
+        <w:spacing w:line="200" w:lineRule="exact" w:before="0" w:after="0"/>
+      </w:pPr>
+    </w:p>
     <w:tbl>
       <w:tblPr>
         <w:tblStyle w:val="Table"/>
@@ -13252,7 +13308,7 @@
     <w:p>
       <w:pPr>
         <w:pStyle w:val="TableCaption"/>
-        <w:spacing w:before="240" w:after="60" w:line="240" w:lineRule="auto"/>
+        <w:spacing w:before="40" w:after="40" w:line="240" w:lineRule="auto"/>
         <w:jc w:val="center"/>
         <w:keepNext/>
         <w:keepLines/>
@@ -13597,6 +13653,11 @@
           <w:cols w:num="2" w:space="288" w:equalWidth="1"/>
           <w:docGrid w:linePitch="360"/>
         </w:sectPr>
+      </w:pPr>
+    </w:p>
+    <w:p>
+      <w:pPr>
+        <w:spacing w:line="200" w:lineRule="exact" w:before="0" w:after="0"/>
       </w:pPr>
     </w:p>
     <w:tbl>
@@ -14716,7 +14777,7 @@
     <w:p>
       <w:pPr>
         <w:pStyle w:val="TableCaption"/>
-        <w:spacing w:before="240" w:after="60" w:line="240" w:lineRule="auto"/>
+        <w:spacing w:before="40" w:after="40" w:line="240" w:lineRule="auto"/>
         <w:jc w:val="center"/>
         <w:keepNext/>
         <w:keepLines/>
@@ -14824,6 +14885,11 @@
           <w:cols w:num="2" w:space="288" w:equalWidth="1"/>
           <w:docGrid w:linePitch="360"/>
         </w:sectPr>
+      </w:pPr>
+    </w:p>
+    <w:p>
+      <w:pPr>
+        <w:spacing w:line="200" w:lineRule="exact" w:before="0" w:after="0"/>
       </w:pPr>
     </w:p>
     <w:tbl>
@@ -16120,7 +16186,7 @@
     <w:p>
       <w:pPr>
         <w:pStyle w:val="TableCaption"/>
-        <w:spacing w:before="240" w:after="60" w:line="240" w:lineRule="auto"/>
+        <w:spacing w:before="40" w:after="40" w:line="240" w:lineRule="auto"/>
         <w:jc w:val="center"/>
         <w:keepNext/>
         <w:keepLines/>
@@ -16237,6 +16303,11 @@
           <w:cols w:num="2" w:space="288" w:equalWidth="1"/>
           <w:docGrid w:linePitch="360"/>
         </w:sectPr>
+      </w:pPr>
+    </w:p>
+    <w:p>
+      <w:pPr>
+        <w:spacing w:line="200" w:lineRule="exact" w:before="0" w:after="0"/>
       </w:pPr>
     </w:p>
     <w:tbl>
@@ -17533,7 +17604,7 @@
     <w:p>
       <w:pPr>
         <w:pStyle w:val="TableCaption"/>
-        <w:spacing w:before="240" w:after="60" w:line="240" w:lineRule="auto"/>
+        <w:spacing w:before="40" w:after="40" w:line="240" w:lineRule="auto"/>
         <w:jc w:val="center"/>
         <w:keepNext/>
         <w:keepLines/>
@@ -17672,6 +17743,11 @@
           <w:cols w:num="2" w:space="288" w:equalWidth="1"/>
           <w:docGrid w:linePitch="360"/>
         </w:sectPr>
+      </w:pPr>
+    </w:p>
+    <w:p>
+      <w:pPr>
+        <w:spacing w:line="200" w:lineRule="exact" w:before="0" w:after="0"/>
       </w:pPr>
     </w:p>
     <w:tbl>
@@ -18614,7 +18690,7 @@
     <w:p>
       <w:pPr>
         <w:pStyle w:val="TableCaption"/>
-        <w:spacing w:before="240" w:after="60" w:line="240" w:lineRule="auto"/>
+        <w:spacing w:before="40" w:after="40" w:line="240" w:lineRule="auto"/>
         <w:jc w:val="center"/>
         <w:keepNext/>
         <w:keepLines/>
@@ -18744,6 +18820,11 @@
           <w:cols w:num="2" w:space="288" w:equalWidth="1"/>
           <w:docGrid w:linePitch="360"/>
         </w:sectPr>
+      </w:pPr>
+    </w:p>
+    <w:p>
+      <w:pPr>
+        <w:spacing w:line="200" w:lineRule="exact" w:before="0" w:after="0"/>
       </w:pPr>
     </w:p>
     <w:tbl>
@@ -19863,7 +19944,7 @@
     <w:p>
       <w:pPr>
         <w:pStyle w:val="TableCaption"/>
-        <w:spacing w:before="240" w:after="60" w:line="240" w:lineRule="auto"/>
+        <w:spacing w:before="40" w:after="40" w:line="240" w:lineRule="auto"/>
         <w:jc w:val="center"/>
         <w:keepNext/>
         <w:keepLines/>
@@ -19946,6 +20027,11 @@
           <w:cols w:num="2" w:space="288" w:equalWidth="1"/>
           <w:docGrid w:linePitch="360"/>
         </w:sectPr>
+      </w:pPr>
+    </w:p>
+    <w:p>
+      <w:pPr>
+        <w:spacing w:line="200" w:lineRule="exact" w:before="0" w:after="0"/>
       </w:pPr>
     </w:p>
     <w:tbl>
@@ -20951,7 +21037,7 @@
     <w:p>
       <w:pPr>
         <w:pStyle w:val="TableCaption"/>
-        <w:spacing w:before="240" w:after="60" w:line="240" w:lineRule="auto"/>
+        <w:spacing w:before="40" w:after="40" w:line="240" w:lineRule="auto"/>
         <w:jc w:val="center"/>
         <w:keepNext/>
         <w:keepLines/>
@@ -21034,6 +21120,11 @@
           <w:cols w:num="2" w:space="288" w:equalWidth="1"/>
           <w:docGrid w:linePitch="360"/>
         </w:sectPr>
+      </w:pPr>
+    </w:p>
+    <w:p>
+      <w:pPr>
+        <w:spacing w:line="200" w:lineRule="exact" w:before="0" w:after="0"/>
       </w:pPr>
     </w:p>
     <w:tbl>
@@ -21799,7 +21890,7 @@
     <w:p>
       <w:pPr>
         <w:pStyle w:val="TableCaption"/>
-        <w:spacing w:before="240" w:after="60" w:line="240" w:lineRule="auto"/>
+        <w:spacing w:before="40" w:after="40" w:line="240" w:lineRule="auto"/>
         <w:jc w:val="center"/>
         <w:keepNext/>
         <w:keepLines/>
@@ -22172,6 +22263,11 @@
           <w:cols w:num="2" w:space="288" w:equalWidth="1"/>
           <w:docGrid w:linePitch="360"/>
         </w:sectPr>
+      </w:pPr>
+    </w:p>
+    <w:p>
+      <w:pPr>
+        <w:spacing w:line="200" w:lineRule="exact" w:before="0" w:after="0"/>
       </w:pPr>
     </w:p>
     <w:tbl>
@@ -23261,7 +23357,7 @@
     <w:p>
       <w:pPr>
         <w:pStyle w:val="TableCaption"/>
-        <w:spacing w:before="240" w:after="60" w:line="240" w:lineRule="auto"/>
+        <w:spacing w:before="40" w:after="40" w:line="240" w:lineRule="auto"/>
         <w:jc w:val="center"/>
         <w:keepNext/>
         <w:keepLines/>
@@ -24549,6 +24645,11 @@
           <w:cols w:num="2" w:space="288" w:equalWidth="1"/>
           <w:docGrid w:linePitch="360"/>
         </w:sectPr>
+      </w:pPr>
+    </w:p>
+    <w:p>
+      <w:pPr>
+        <w:spacing w:line="200" w:lineRule="exact" w:before="0" w:after="0"/>
       </w:pPr>
     </w:p>
     <w:tbl>
@@ -25845,7 +25946,7 @@
     <w:p>
       <w:pPr>
         <w:pStyle w:val="TableCaption"/>
-        <w:spacing w:before="240" w:after="60" w:line="240" w:lineRule="auto"/>
+        <w:spacing w:before="40" w:after="40" w:line="240" w:lineRule="auto"/>
         <w:jc w:val="center"/>
         <w:keepNext/>
         <w:keepLines/>
@@ -25928,6 +26029,11 @@
           <w:cols w:num="2" w:space="288" w:equalWidth="1"/>
           <w:docGrid w:linePitch="360"/>
         </w:sectPr>
+      </w:pPr>
+    </w:p>
+    <w:p>
+      <w:pPr>
+        <w:spacing w:line="200" w:lineRule="exact" w:before="0" w:after="0"/>
       </w:pPr>
     </w:p>
     <w:tbl>
@@ -26693,7 +26799,7 @@
     <w:p>
       <w:pPr>
         <w:pStyle w:val="TableCaption"/>
-        <w:spacing w:before="240" w:after="60" w:line="240" w:lineRule="auto"/>
+        <w:spacing w:before="40" w:after="40" w:line="240" w:lineRule="auto"/>
         <w:jc w:val="center"/>
         <w:keepNext/>
         <w:keepLines/>
@@ -28533,7 +28639,7 @@
     <w:qFormat/>
     <w:rsid w:val="00FC693F"/>
     <w:pPr>
-      <w:spacing w:line="240" w:lineRule="auto"/>
+      <w:spacing w:line="240" w:lineRule="auto" w:before="40" w:after="40"/>
     </w:pPr>
     <w:rPr>
       <w:b/>
@@ -39497,7 +39603,7 @@
     <w:basedOn w:val="BodyText"/>
     <w:pPr>
       <w:keepNext w:val="0"/>
-      <w:spacing w:after="120" w:before="80" w:line="240" w:lineRule="auto"/>
+      <w:spacing w:after="40" w:before="40" w:line="240" w:lineRule="auto"/>
       <w:jc w:val="center"/>
     </w:pPr>
     <w:rPr>
@@ -39512,7 +39618,7 @@
     <w:basedOn w:val="BodyText"/>
     <w:pPr>
       <w:keepNext/>
-      <w:spacing w:after="60" w:before="240" w:line="240" w:lineRule="auto"/>
+      <w:spacing w:after="40" w:before="40" w:line="240" w:lineRule="auto"/>
       <w:jc w:val="center"/>
     </w:pPr>
     <w:rPr>

</xml_diff>